<commit_message>
Fill group 42 conditions into report template
Co-Authored-By: Claude Opus 5.5 <noreply@anthropic.com>
</commit_message>
<xml_diff>
--- a/GroupSettings/4EB00Special Topic Jet Engine Report Template 2026.docx
+++ b/GroupSettings/4EB00Special Topic Jet Engine Report Template 2026.docx
@@ -690,6 +690,14 @@
                 <w:sz w:val="24"/>
               </w:rPr>
             </w:pPr>
+            <w:r>
+              <w:rPr>
+                <w:b/>
+                <w:color w:val="C00000"/>
+                <w:sz w:val="24"/>
+              </w:rPr>
+              <w:t>H2</w:t>
+            </w:r>
           </w:p>
         </w:tc>
         <w:tc>
@@ -744,6 +752,14 @@
                 <w:sz w:val="24"/>
               </w:rPr>
             </w:pPr>
+            <w:r>
+              <w:rPr>
+                <w:b/>
+                <w:color w:val="C00000"/>
+                <w:sz w:val="24"/>
+              </w:rPr>
+              <w:t>300.00</w:t>
+            </w:r>
           </w:p>
         </w:tc>
         <w:tc>
@@ -806,6 +822,14 @@
                 <w:sz w:val="24"/>
               </w:rPr>
             </w:pPr>
+            <w:r>
+              <w:rPr>
+                <w:b/>
+                <w:color w:val="C00000"/>
+                <w:sz w:val="24"/>
+              </w:rPr>
+              <w:t>9.00</w:t>
+            </w:r>
           </w:p>
         </w:tc>
         <w:tc>
@@ -868,6 +892,14 @@
                 <w:sz w:val="24"/>
               </w:rPr>
             </w:pPr>
+            <w:r>
+              <w:rPr>
+                <w:b/>
+                <w:color w:val="C00000"/>
+                <w:sz w:val="24"/>
+              </w:rPr>
+              <w:t>100000.00</w:t>
+            </w:r>
           </w:p>
         </w:tc>
         <w:tc>
@@ -930,6 +962,14 @@
                 <w:sz w:val="24"/>
               </w:rPr>
             </w:pPr>
+            <w:r>
+              <w:rPr>
+                <w:b/>
+                <w:color w:val="C00000"/>
+                <w:sz w:val="24"/>
+              </w:rPr>
+              <w:t>0.58</w:t>
+            </w:r>
           </w:p>
         </w:tc>
         <w:tc>
@@ -992,6 +1032,14 @@
                 <w:sz w:val="24"/>
               </w:rPr>
             </w:pPr>
+            <w:r>
+              <w:rPr>
+                <w:b/>
+                <w:color w:val="C00000"/>
+                <w:sz w:val="24"/>
+              </w:rPr>
+              <w:t>170.35</w:t>
+            </w:r>
           </w:p>
         </w:tc>
         <w:tc>
@@ -1054,6 +1102,14 @@
                 <w:sz w:val="24"/>
               </w:rPr>
             </w:pPr>
+            <w:r>
+              <w:rPr>
+                <w:b/>
+                <w:color w:val="C00000"/>
+                <w:sz w:val="24"/>
+              </w:rPr>
+              <w:t>200.00</w:t>
+            </w:r>
           </w:p>
         </w:tc>
         <w:tc>

</xml_diff>